<commit_message>
Update CV without student ID
</commit_message>
<xml_diff>
--- a/Nari_Qian_CV.docx
+++ b/Nari_Qian_CV.docx
@@ -2,148 +2,51 @@
 <file path=word/document.xml><?xml version="1.0" encoding="utf-8"?>
 <w:document xmlns:wpc="http://schemas.microsoft.com/office/word/2010/wordprocessingCanvas" xmlns:mo="http://schemas.microsoft.com/office/mac/office/2008/main" xmlns:mc="http://schemas.openxmlformats.org/markup-compatibility/2006" xmlns:mv="urn:schemas-microsoft-com:mac:vml" xmlns:o="urn:schemas-microsoft-com:office:office" xmlns:r="http://schemas.openxmlformats.org/officeDocument/2006/relationships" xmlns:m="http://schemas.openxmlformats.org/officeDocument/2006/math" xmlns:v="urn:schemas-microsoft-com:vml" xmlns:wp14="http://schemas.microsoft.com/office/word/2010/wordprocessingDrawing" xmlns:wp="http://schemas.openxmlformats.org/drawingml/2006/wordprocessingDrawing" xmlns:w10="urn:schemas-microsoft-com:office:word" xmlns:w="http://schemas.openxmlformats.org/wordprocessingml/2006/main" xmlns:w14="http://schemas.microsoft.com/office/word/2010/wordml" xmlns:wpg="http://schemas.microsoft.com/office/word/2010/wordprocessingGroup" xmlns:wpi="http://schemas.microsoft.com/office/word/2010/wordprocessingInk" xmlns:wne="http://schemas.microsoft.com/office/word/2006/wordml" xmlns:wps="http://schemas.microsoft.com/office/word/2010/wordprocessingShape" mc:Ignorable="w14 wp14">
   <w:body>
-    <w:tbl>
-      <w:tblPr>
-        <w:tblW w:type="dxa" w:w="9935"/>
-        <w:tblLayout w:type="fixed"/>
-        <w:tblLook w:firstColumn="1" w:firstRow="1" w:lastColumn="0" w:lastRow="0" w:noHBand="0" w:noVBand="1" w:val="04A0"/>
-      </w:tblPr>
-      <w:tblGrid>
-        <w:gridCol w:w="7703"/>
-        <w:gridCol w:w="2232"/>
-      </w:tblGrid>
-      <w:tr>
-        <w:tc>
-          <w:tcPr>
-            <w:tcW w:type="dxa" w:w="7703"/>
-          </w:tcPr>
-          <w:p>
-            <w:pPr>
-              <w:spacing w:after="40"/>
-            </w:pPr>
-            <w:r>
-              <w:rPr>
-                <w:rFonts w:ascii="Arial" w:hAnsi="Arial" w:eastAsia="Arial"/>
-                <w:b/>
-                <w:i w:val="0"/>
-                <w:color w:val="111827"/>
-                <w:sz w:val="40"/>
-              </w:rPr>
-              <w:t>Nari Qian</w:t>
-            </w:r>
-          </w:p>
-          <w:p>
-            <w:pPr>
-              <w:spacing w:after="40"/>
-            </w:pPr>
-            <w:r>
-              <w:rPr>
-                <w:rFonts w:ascii="Arial" w:hAnsi="Arial" w:eastAsia="Arial"/>
-                <w:b w:val="0"/>
-                <w:i w:val="0"/>
-                <w:color w:val="5F6B7A"/>
-                <w:sz w:val="20"/>
-              </w:rPr>
-              <w:t>BSc Accounting &amp; Finance, King's College London | AI Finance Intern</w:t>
-            </w:r>
-          </w:p>
-          <w:p>
-            <w:pPr>
-              <w:spacing w:after="0"/>
-            </w:pPr>
-            <w:r>
-              <w:rPr>
-                <w:rFonts w:ascii="Arial" w:hAnsi="Arial" w:eastAsia="Arial"/>
-                <w:b w:val="0"/>
-                <w:i w:val="0"/>
-                <w:color w:val="5F6B7A"/>
-                <w:sz w:val="19"/>
-              </w:rPr>
-              <w:t>15921421508@163.com | KCL Student ID: K24094067 | London, UK / Shenzhen, China</w:t>
-            </w:r>
-          </w:p>
-        </w:tc>
-        <w:tc>
-          <w:tcPr>
-            <w:tcW w:type="dxa" w:w="2232"/>
-            <w:vAlign w:val="top"/>
-          </w:tcPr>
-          <w:p>
-            <w:pPr>
-              <w:spacing w:after="20"/>
-              <w:jc w:val="center"/>
-            </w:pPr>
-            <w:r>
-              <w:drawing>
-                <wp:inline xmlns:a="http://schemas.openxmlformats.org/drawingml/2006/main" xmlns:pic="http://schemas.openxmlformats.org/drawingml/2006/picture">
-                  <wp:extent cx="749808" cy="749808"/>
-                  <wp:docPr id="1" name="Picture 1"/>
-                  <wp:cNvGraphicFramePr>
-                    <a:graphicFrameLocks noChangeAspect="1"/>
-                  </wp:cNvGraphicFramePr>
-                  <a:graphic>
-                    <a:graphicData uri="http://schemas.openxmlformats.org/drawingml/2006/picture">
-                      <pic:pic>
-                        <pic:nvPicPr>
-                          <pic:cNvPr id="0" name="Nari_Qian_resume_site_qr.png"/>
-                          <pic:cNvPicPr/>
-                        </pic:nvPicPr>
-                        <pic:blipFill>
-                          <a:blip r:embed="rId9"/>
-                          <a:stretch>
-                            <a:fillRect/>
-                          </a:stretch>
-                        </pic:blipFill>
-                        <pic:spPr>
-                          <a:xfrm>
-                            <a:off x="0" y="0"/>
-                            <a:ext cx="749808" cy="749808"/>
-                          </a:xfrm>
-                          <a:prstGeom prst="rect"/>
-                        </pic:spPr>
-                      </pic:pic>
-                    </a:graphicData>
-                  </a:graphic>
-                </wp:inline>
-              </w:drawing>
-            </w:r>
-          </w:p>
-          <w:p>
-            <w:pPr>
-              <w:spacing w:after="0"/>
-              <w:jc w:val="center"/>
-            </w:pPr>
-            <w:r>
-              <w:rPr>
-                <w:rFonts w:ascii="Arial" w:hAnsi="Arial" w:eastAsia="Arial"/>
-                <w:b/>
-                <w:i w:val="0"/>
-                <w:color w:val="174A7C"/>
-                <w:sz w:val="14"/>
-              </w:rPr>
-              <w:t>Website</w:t>
-            </w:r>
-          </w:p>
-          <w:p>
-            <w:pPr>
-              <w:spacing w:after="0"/>
-              <w:jc w:val="center"/>
-            </w:pPr>
-            <w:hyperlink r:id="rId10">
-              <w:r>
-                <w:rPr>
-                  <w:rFonts w:ascii="Arial" w:hAnsi="Arial" w:eastAsia="Arial"/>
-                  <w:b w:val="0"/>
-                  <w:color w:val="174A7C"/>
-                  <w:sz w:val="11"/>
-                </w:rPr>
-                <w:t>athenaqian.github.io</w:t>
-              </w:r>
-            </w:hyperlink>
-          </w:p>
-        </w:tc>
-      </w:tr>
-    </w:tbl>
+    <w:p>
+      <w:pPr>
+        <w:spacing w:after="40"/>
+      </w:pPr>
+      <w:r>
+        <w:rPr>
+          <w:rFonts w:ascii="Arial" w:hAnsi="Arial" w:eastAsia="Arial"/>
+          <w:b/>
+          <w:i w:val="0"/>
+          <w:color w:val="111827"/>
+          <w:sz w:val="40"/>
+        </w:rPr>
+        <w:t>Nari Qian</w:t>
+      </w:r>
+    </w:p>
+    <w:p>
+      <w:pPr>
+        <w:spacing w:after="40"/>
+      </w:pPr>
+      <w:r>
+        <w:rPr>
+          <w:rFonts w:ascii="Arial" w:hAnsi="Arial" w:eastAsia="Arial"/>
+          <w:b w:val="0"/>
+          <w:i w:val="0"/>
+          <w:color w:val="5F6B7A"/>
+          <w:sz w:val="20"/>
+        </w:rPr>
+        <w:t>BSc Accounting &amp; Finance, King's College London | AI Finance Intern</w:t>
+      </w:r>
+    </w:p>
+    <w:p>
+      <w:pPr>
+        <w:spacing w:after="0"/>
+      </w:pPr>
+      <w:r>
+        <w:rPr>
+          <w:rFonts w:ascii="Arial" w:hAnsi="Arial" w:eastAsia="Arial"/>
+          <w:b w:val="0"/>
+          <w:i w:val="0"/>
+          <w:color w:val="5F6B7A"/>
+          <w:sz w:val="19"/>
+        </w:rPr>
+        <w:t>15921421508@163.com | London, UK / Shenzhen, China</w:t>
+      </w:r>
+    </w:p>
     <w:p>
       <w:pPr>
         <w:spacing w:after="160"/>
@@ -627,7 +530,7 @@
           <w:color w:val="1F2937"/>
           <w:sz w:val="20"/>
         </w:rPr>
-        <w:t>Financial analysis; business analysis; capital markets and valuation interest; financial documentation; invoice checking; reimbursement workflows; tender/bidding materials; commercial proposals; quotation sheets; accounting and finance coursework.</w:t>
+        <w:t>Financial analysis; business analysis; Foundational knowledge of capital markets and valuation; financial documentation; invoice checking; reimbursement workflows; tender/bidding materials; commercial proposals; quotation sheets; accounting and finance coursework.</w:t>
       </w:r>
     </w:p>
     <w:p>
@@ -683,6 +586,7 @@
       </w:r>
     </w:p>
     <w:sectPr>
+      <w:headerReference w:type="default" r:id="rId9"/>
       <w:pgSz w:w="12240" w:h="15840"/>
       <w:pgMar w:top="893" w:right="1037" w:bottom="893" w:left="1037" w:header="504" w:footer="504" w:gutter="0"/>
       <w:cols w:space="720"/>
@@ -690,6 +594,65 @@
     </w:sectPr>
   </w:body>
 </w:document>
+</file>
+
+<file path=word/header1.xml><?xml version="1.0" encoding="utf-8"?>
+<w:hdr xmlns:m="http://schemas.openxmlformats.org/officeDocument/2006/math" xmlns:mc="http://schemas.openxmlformats.org/markup-compatibility/2006" xmlns:mo="http://schemas.microsoft.com/office/mac/office/2008/main" xmlns:mv="urn:schemas-microsoft-com:mac:vml" xmlns:o="urn:schemas-microsoft-com:office:office" xmlns:r="http://schemas.openxmlformats.org/officeDocument/2006/relationships" xmlns:v="urn:schemas-microsoft-com:vml" xmlns:w10="urn:schemas-microsoft-com:office:word" xmlns:w14="http://schemas.microsoft.com/office/word/2010/wordml" xmlns:w="http://schemas.openxmlformats.org/wordprocessingml/2006/main" xmlns:wne="http://schemas.microsoft.com/office/word/2006/wordml" xmlns:wp14="http://schemas.microsoft.com/office/word/2010/wordprocessingDrawing" xmlns:wp="http://schemas.openxmlformats.org/drawingml/2006/wordprocessingDrawing" xmlns:wpc="http://schemas.microsoft.com/office/word/2010/wordprocessingCanvas" xmlns:wpg="http://schemas.microsoft.com/office/word/2010/wordprocessingGroup" xmlns:wpi="http://schemas.microsoft.com/office/word/2010/wordprocessingInk" xmlns:wps="http://schemas.microsoft.com/office/word/2010/wordprocessingShape" mc:Ignorable="w14 wp14">
+  <w:p>
+    <w:pPr>
+      <w:pStyle w:val="Header"/>
+      <w:spacing w:after="0"/>
+      <w:jc w:val="right"/>
+    </w:pPr>
+    <w:r>
+      <w:drawing>
+        <wp:inline xmlns:a="http://schemas.openxmlformats.org/drawingml/2006/main" xmlns:pic="http://schemas.openxmlformats.org/drawingml/2006/picture">
+          <wp:extent cx="530352" cy="530352"/>
+          <wp:docPr id="1" name="Picture 1"/>
+          <wp:cNvGraphicFramePr>
+            <a:graphicFrameLocks noChangeAspect="1"/>
+          </wp:cNvGraphicFramePr>
+          <a:graphic>
+            <a:graphicData uri="http://schemas.openxmlformats.org/drawingml/2006/picture">
+              <pic:pic>
+                <pic:nvPicPr>
+                  <pic:cNvPr id="0" name="Nari_Qian_resume_site_qr.png"/>
+                  <pic:cNvPicPr/>
+                </pic:nvPicPr>
+                <pic:blipFill>
+                  <a:blip r:embed="rId1"/>
+                  <a:stretch>
+                    <a:fillRect/>
+                  </a:stretch>
+                </pic:blipFill>
+                <pic:spPr>
+                  <a:xfrm>
+                    <a:off x="0" y="0"/>
+                    <a:ext cx="530352" cy="530352"/>
+                  </a:xfrm>
+                  <a:prstGeom prst="rect"/>
+                </pic:spPr>
+              </pic:pic>
+            </a:graphicData>
+          </a:graphic>
+        </wp:inline>
+      </w:drawing>
+    </w:r>
+    <w:r>
+      <w:br/>
+    </w:r>
+    <w:r>
+      <w:rPr>
+        <w:rFonts w:ascii="Arial" w:hAnsi="Arial" w:eastAsia="Arial"/>
+        <w:b w:val="0"/>
+        <w:i w:val="0"/>
+        <w:color w:val="174A7C"/>
+        <w:sz w:val="12"/>
+      </w:rPr>
+      <w:t>athenaqian.github.io</w:t>
+    </w:r>
+  </w:p>
+</w:hdr>
 </file>
 
 <file path=word/numbering.xml><?xml version="1.0" encoding="utf-8"?>

</xml_diff>